<commit_message>
Refocus portfolio wording for welder roles
</commit_message>
<xml_diff>
--- a/Putra-Shahara-Vely-Professional-CV.docx
+++ b/Putra-Shahara-Vely-Professional-CV.docx
@@ -26,7 +26,7 @@
           <w:color w:val="C99700"/>
           <w:sz w:val="24"/>
         </w:rPr>
-        <w:t xml:space="preserve">Operations, Quality &amp; Production Support Candidate</w:t>
+        <w:t xml:space="preserve">Professional Welder Candidate | FCAW &amp; SMAW</w:t>
       </w:r>
     </w:p>
     <w:tbl>
@@ -116,7 +116,7 @@
         <w:spacing w:after="220"/>
       </w:pPr>
       <w:r>
-        <w:t xml:space="preserve">Field-trained professional with hands-on welding experience, strong discipline, attention to detail, safety awareness, and the adaptability to grow across publishing, production, and operational environments. Experienced in following technical instructions, maintaining work quality, supporting team-based execution, and working responsibly in structured industrial settings.</w:t>
+        <w:t xml:space="preserve">Trained welder with FCAW and SMAW experience, strong safety awareness, disciplined work habits, and a quality-focused mindset for industrial fabrication, workshop production, construction support, maintenance, and project-based welding environments. Experienced in following technical instructions, maintaining work quality, using protective equipment, and working responsibly in structured field settings.</w:t>
       </w:r>
     </w:p>
     <w:p>
@@ -142,7 +142,7 @@
           <w:color w:val="202421"/>
           <w:sz w:val="22"/>
         </w:rPr>
-        <w:t xml:space="preserve">Technical Foundation</w:t>
+        <w:t xml:space="preserve">Welding Skills</w:t>
       </w:r>
     </w:p>
     <w:p>
@@ -233,7 +233,7 @@
           <w:color w:val="202421"/>
           <w:sz w:val="22"/>
         </w:rPr>
-        <w:t xml:space="preserve">Transferable Skills</w:t>
+        <w:t xml:space="preserve">Work Execution Skills</w:t>
       </w:r>
     </w:p>
     <w:p>
@@ -402,7 +402,7 @@
         <w:spacing w:after="80"/>
       </w:pPr>
       <w:r>
-        <w:t>Creative improvement mindset</w:t>
+        <w:t>Coachability</w:t>
       </w:r>
     </w:p>
     <w:p>
@@ -449,7 +449,7 @@
         <w:spacing w:after="100"/>
       </w:pPr>
       <w:r>
-        <w:t xml:space="preserve">Performed welding work with focus on process accuracy, workplace safety, and quality consistency. Worked in team-based environments, followed technical direction, and maintained output quality according to project requirements.</w:t>
+        <w:t xml:space="preserve">Performed welding work with focus on process accuracy, workplace safety, and quality consistency. Worked in team-based environments, followed technical direction, and maintained welding output quality according to project requirements.</w:t>
       </w:r>
     </w:p>
     <w:p>
@@ -589,7 +589,7 @@
           <w:color w:val="C99700"/>
           <w:sz w:val="24"/>
         </w:rPr>
-        <w:t xml:space="preserve">PROFESSIONAL CASE HIGHLIGHTS</w:t>
+        <w:t xml:space="preserve">PROFESSIONAL HIGHLIGHTS</w:t>
       </w:r>
     </w:p>
     <w:p>
@@ -602,7 +602,7 @@
           <w:color w:val="202421"/>
           <w:sz w:val="22"/>
         </w:rPr>
-        <w:t xml:space="preserve">Quality Consistency in Technical Work</w:t>
+        <w:t xml:space="preserve">Quality Consistency in Welding Work</w:t>
       </w:r>
     </w:p>
     <w:p>
@@ -610,7 +610,7 @@
         <w:spacing w:after="120"/>
       </w:pPr>
       <w:r>
-        <w:t xml:space="preserve">Developed a routine of checking work instructions, preparing tools, maintaining area focus, and reviewing results before moving work forward.</w:t>
+        <w:t xml:space="preserve">Developed a routine of checking work instructions, preparing tools, maintaining area focus, and reviewing welding results before moving work forward.</w:t>
       </w:r>
     </w:p>
     <w:p>
@@ -631,7 +631,7 @@
         <w:spacing w:after="120"/>
       </w:pPr>
       <w:r>
-        <w:t xml:space="preserve">Followed instructions carefully, worked with caution, and prioritized safe process execution before speed.</w:t>
+        <w:t xml:space="preserve">Follows instructions carefully, works with caution, and prioritizes safe process execution before speed.</w:t>
       </w:r>
     </w:p>
     <w:p>
@@ -644,7 +644,7 @@
           <w:color w:val="202421"/>
           <w:sz w:val="22"/>
         </w:rPr>
-        <w:t xml:space="preserve">Adapting Field Experience to Corporate Environments</w:t>
+        <w:t xml:space="preserve">Readiness for Project-Based Welding Environments</w:t>
       </w:r>
     </w:p>
     <w:p>
@@ -652,7 +652,7 @@
         <w:spacing w:after="120"/>
       </w:pPr>
       <w:r>
-        <w:t xml:space="preserve">Field experience demonstrates discipline, reliability, coachability, and readiness to learn new business processes.</w:t>
+        <w:t xml:space="preserve">Field experience demonstrates discipline, reliability, coachability, and readiness to learn project-specific procedures and welding standards.</w:t>
       </w:r>
     </w:p>
     <w:p>
@@ -673,7 +673,7 @@
         <w:spacing w:after="220"/>
       </w:pPr>
       <w:r>
-        <w:t xml:space="preserve">To build a long-term career in publishing, production, or operational environments by supporting workflow execution, maintaining work quality, learning company processes, and contributing with consistency. Open to support roles such as production support, quality support, warehouse or operations support, document control assistant, or junior production administration.</w:t>
+        <w:t xml:space="preserve">To build a long-term career as a professional welder by contributing to safe, disciplined, and quality-focused welding work. Open to welder opportunities in fabrication, industrial projects, workshop production, construction support, or maintenance environments where technical discipline, teamwork, and reliable execution are valued.</w:t>
       </w:r>
     </w:p>
     <w:p>
@@ -699,46 +699,46 @@
         <w:spacing w:after="80"/>
       </w:pPr>
       <w:r>
-        <w:t>Disciplined field-work mindset with pressure tolerance and result orientation.</w:t>
-      </w:r>
-    </w:p>
-    <w:p>
-      <w:pPr>
-        <w:pStyle w:val="Bullet"/>
-        <w:numPr>
-          <w:ilvl w:val="0"/>
-          <w:numId w:val="1"/>
-        </w:numPr>
-        <w:spacing w:after="80"/>
-      </w:pPr>
-      <w:r>
-        <w:t>Used to following standards, instructions, SOPs, and supervisor direction.</w:t>
-      </w:r>
-    </w:p>
-    <w:p>
-      <w:pPr>
-        <w:pStyle w:val="Bullet"/>
-        <w:numPr>
-          <w:ilvl w:val="0"/>
-          <w:numId w:val="1"/>
-        </w:numPr>
-        <w:spacing w:after="80"/>
-      </w:pPr>
-      <w:r>
-        <w:t>Organized, honest, responsible, and coachable working character.</w:t>
-      </w:r>
-    </w:p>
-    <w:p>
-      <w:pPr>
-        <w:pStyle w:val="Bullet"/>
-        <w:numPr>
-          <w:ilvl w:val="0"/>
-          <w:numId w:val="1"/>
-        </w:numPr>
-        <w:spacing w:after="80"/>
-      </w:pPr>
-      <w:r>
-        <w:t>Ready to learn publishing or production workflows while maintaining a strong work ethic.</w:t>
+        <w:t>Trained in FCAW GS 3G/4G, SMAW GS 3G/4G, and SMAW 6G.</w:t>
+      </w:r>
+    </w:p>
+    <w:p>
+      <w:pPr>
+        <w:pStyle w:val="Bullet"/>
+        <w:numPr>
+          <w:ilvl w:val="0"/>
+          <w:numId w:val="1"/>
+        </w:numPr>
+        <w:spacing w:after="80"/>
+      </w:pPr>
+      <w:r>
+        <w:t>Brings a disciplined field-work mindset with safety awareness and result orientation.</w:t>
+      </w:r>
+    </w:p>
+    <w:p>
+      <w:pPr>
+        <w:pStyle w:val="Bullet"/>
+        <w:numPr>
+          <w:ilvl w:val="0"/>
+          <w:numId w:val="1"/>
+        </w:numPr>
+        <w:spacing w:after="80"/>
+      </w:pPr>
+      <w:r>
+        <w:t>Used to following technical instructions, SOPs, and supervisor direction.</w:t>
+      </w:r>
+    </w:p>
+    <w:p>
+      <w:pPr>
+        <w:pStyle w:val="Bullet"/>
+        <w:numPr>
+          <w:ilvl w:val="0"/>
+          <w:numId w:val="1"/>
+        </w:numPr>
+        <w:spacing w:after="80"/>
+      </w:pPr>
+      <w:r>
+        <w:t>Shows organized, honest, responsible, and coachable working character.</w:t>
       </w:r>
     </w:p>
     <w:sectPr>

</xml_diff>